<commit_message>
Adição de segunda Exchange
</commit_message>
<xml_diff>
--- a/docs/01-documentacao-arquitetural.docx
+++ b/docs/01-documentacao-arquitetural.docx
@@ -20,12 +20,10 @@
         <w:t>Documentacao arquitetural</w:t>
       </w:r>
     </w:p>
-    <w:p/>
     <w:tbl>
       <w:tblPr>
         <w:tblStyle w:val="TableGrid"/>
         <w:tblW w:type="auto" w:w="0"/>
-        <w:tblLayout w:type="autofit"/>
         <w:tblLook w:firstColumn="1" w:firstRow="1" w:lastColumn="0" w:lastRow="0" w:noHBand="0" w:noVBand="1" w:val="04A0"/>
       </w:tblPr>
       <w:tblGrid>
@@ -36,8 +34,8 @@
         <w:tc>
           <w:tcPr>
             <w:tcW w:type="dxa" w:w="4680"/>
+            <w:vAlign w:val="center"/>
             <w:shd w:fill="F2F4F7"/>
-            <w:vAlign w:val="center"/>
           </w:tcPr>
           <w:p>
             <w:r/>
@@ -54,8 +52,8 @@
         <w:tc>
           <w:tcPr>
             <w:tcW w:type="dxa" w:w="4680"/>
+            <w:vAlign w:val="center"/>
             <w:shd w:fill="F2F4F7"/>
-            <w:vAlign w:val="center"/>
           </w:tcPr>
           <w:p>
             <w:r/>
@@ -287,7 +285,6 @@
       <w:tblPr>
         <w:tblStyle w:val="TableGrid"/>
         <w:tblW w:type="auto" w:w="0"/>
-        <w:tblLayout w:type="autofit"/>
         <w:tblLook w:firstColumn="1" w:firstRow="1" w:lastColumn="0" w:lastRow="0" w:noHBand="0" w:noVBand="1" w:val="04A0"/>
       </w:tblPr>
       <w:tblGrid>
@@ -298,8 +295,8 @@
         <w:tc>
           <w:tcPr>
             <w:tcW w:type="dxa" w:w="4680"/>
+            <w:vAlign w:val="center"/>
             <w:shd w:fill="F2F4F7"/>
-            <w:vAlign w:val="center"/>
           </w:tcPr>
           <w:p>
             <w:r/>
@@ -316,8 +313,8 @@
         <w:tc>
           <w:tcPr>
             <w:tcW w:type="dxa" w:w="4680"/>
+            <w:vAlign w:val="center"/>
             <w:shd w:fill="F2F4F7"/>
-            <w:vAlign w:val="center"/>
           </w:tcPr>
           <w:p>
             <w:r/>
@@ -706,7 +703,6 @@
       <w:tblPr>
         <w:tblStyle w:val="TableGrid"/>
         <w:tblW w:type="auto" w:w="0"/>
-        <w:tblLayout w:type="autofit"/>
         <w:tblLook w:firstColumn="1" w:firstRow="1" w:lastColumn="0" w:lastRow="0" w:noHBand="0" w:noVBand="1" w:val="04A0"/>
       </w:tblPr>
       <w:tblGrid>
@@ -718,8 +714,8 @@
         <w:tc>
           <w:tcPr>
             <w:tcW w:type="dxa" w:w="3120"/>
+            <w:vAlign w:val="center"/>
             <w:shd w:fill="F2F4F7"/>
-            <w:vAlign w:val="center"/>
           </w:tcPr>
           <w:p>
             <w:r/>
@@ -736,8 +732,8 @@
         <w:tc>
           <w:tcPr>
             <w:tcW w:type="dxa" w:w="3120"/>
+            <w:vAlign w:val="center"/>
             <w:shd w:fill="F2F4F7"/>
-            <w:vAlign w:val="center"/>
           </w:tcPr>
           <w:p>
             <w:r/>
@@ -754,8 +750,8 @@
         <w:tc>
           <w:tcPr>
             <w:tcW w:type="dxa" w:w="3120"/>
+            <w:vAlign w:val="center"/>
             <w:shd w:fill="F2F4F7"/>
-            <w:vAlign w:val="center"/>
           </w:tcPr>
           <w:p>
             <w:r/>
@@ -977,7 +973,7 @@
                 <w:b w:val="0"/>
                 <w:sz w:val="18"/>
               </w:rPr>
-              <w:t>Criacao e status de pedidos</w:t>
+              <w:t>Criacao, status e auditoria de pedidos</w:t>
             </w:r>
           </w:p>
         </w:tc>
@@ -1050,13 +1046,13 @@
         <w:br/>
         <w:t>cloud-commerce -&gt; produto/estoque/pedido via HTTP</w:t>
         <w:br/>
-        <w:t>pedido -&gt; RabbitMQ: pedido.solicitado</w:t>
+        <w:t>pedido -&gt; DirectExchange: pedido.solicitado</w:t>
         <w:br/>
-        <w:t>RabbitMQ -&gt; estoque</w:t>
+        <w:t>estoque -&gt; DirectExchange: estoque.resposta</w:t>
         <w:br/>
-        <w:t>estoque -&gt; RabbitMQ: estoque.resposta</w:t>
+        <w:t>pedido -&gt; TopicExchange: pedido.sem-resposta-estoque</w:t>
         <w:br/>
-        <w:t>RabbitMQ -&gt; pedido</w:t>
+        <w:t>TopicExchange -&gt; fila de auditoria</w:t>
       </w:r>
     </w:p>
     <w:p>
@@ -1071,7 +1067,6 @@
       <w:tblPr>
         <w:tblStyle w:val="TableGrid"/>
         <w:tblW w:type="auto" w:w="0"/>
-        <w:tblLayout w:type="autofit"/>
         <w:tblLook w:firstColumn="1" w:firstRow="1" w:lastColumn="0" w:lastRow="0" w:noHBand="0" w:noVBand="1" w:val="04A0"/>
       </w:tblPr>
       <w:tblGrid>
@@ -1082,8 +1077,8 @@
         <w:tc>
           <w:tcPr>
             <w:tcW w:type="dxa" w:w="4680"/>
+            <w:vAlign w:val="center"/>
             <w:shd w:fill="F2F4F7"/>
-            <w:vAlign w:val="center"/>
           </w:tcPr>
           <w:p>
             <w:r/>
@@ -1100,8 +1095,8 @@
         <w:tc>
           <w:tcPr>
             <w:tcW w:type="dxa" w:w="4680"/>
+            <w:vAlign w:val="center"/>
             <w:shd w:fill="F2F4F7"/>
-            <w:vAlign w:val="center"/>
           </w:tcPr>
           <w:p>
             <w:r/>
@@ -1255,7 +1250,43 @@
                 <w:b w:val="0"/>
                 <w:sz w:val="18"/>
               </w:rPr>
-              <w:t>Roteamento simples por routing key exata</w:t>
+              <w:t>Roteamento principal por routing key exata</w:t>
+            </w:r>
+          </w:p>
+        </w:tc>
+      </w:tr>
+      <w:tr>
+        <w:tc>
+          <w:tcPr>
+            <w:tcW w:type="dxa" w:w="4680"/>
+            <w:vAlign w:val="center"/>
+          </w:tcPr>
+          <w:p>
+            <w:r/>
+            <w:r>
+              <w:rPr>
+                <w:rFonts w:ascii="Calibri" w:hAnsi="Calibri"/>
+                <w:b w:val="0"/>
+                <w:sz w:val="18"/>
+              </w:rPr>
+              <w:t>Topic Exchange</w:t>
+            </w:r>
+          </w:p>
+        </w:tc>
+        <w:tc>
+          <w:tcPr>
+            <w:tcW w:type="dxa" w:w="4680"/>
+            <w:vAlign w:val="center"/>
+          </w:tcPr>
+          <w:p>
+            <w:r/>
+            <w:r>
+              <w:rPr>
+                <w:rFonts w:ascii="Calibri" w:hAnsi="Calibri"/>
+                <w:b w:val="0"/>
+                <w:sz w:val="18"/>
+              </w:rPr>
+              <w:t>Auditoria com binding por padrao pedido.#</w:t>
             </w:r>
           </w:p>
         </w:tc>
@@ -1371,11 +1402,6 @@
     </w:tbl>
     <w:p/>
     <w:p>
-      <w:r>
-        <w:t>Ponto de aderencia: o projeto atualmente usa Direct Exchange. Para atender integralmente ao criterio de dois tipos de exchange, recomenda-se adicionar TopicExchange ou FanoutExchange para eventos de auditoria ou notificacao.</w:t>
-      </w:r>
-    </w:p>
-    <w:p>
       <w:pPr>
         <w:pStyle w:val="Heading1"/>
       </w:pPr>
@@ -1387,7 +1413,6 @@
       <w:tblPr>
         <w:tblStyle w:val="TableGrid"/>
         <w:tblW w:type="auto" w:w="0"/>
-        <w:tblLayout w:type="autofit"/>
         <w:tblLook w:firstColumn="1" w:firstRow="1" w:lastColumn="0" w:lastRow="0" w:noHBand="0" w:noVBand="1" w:val="04A0"/>
       </w:tblPr>
       <w:tblGrid>
@@ -1399,8 +1424,8 @@
         <w:tc>
           <w:tcPr>
             <w:tcW w:type="dxa" w:w="3120"/>
+            <w:vAlign w:val="center"/>
             <w:shd w:fill="F2F4F7"/>
-            <w:vAlign w:val="center"/>
           </w:tcPr>
           <w:p>
             <w:r/>
@@ -1417,8 +1442,8 @@
         <w:tc>
           <w:tcPr>
             <w:tcW w:type="dxa" w:w="3120"/>
+            <w:vAlign w:val="center"/>
             <w:shd w:fill="F2F4F7"/>
-            <w:vAlign w:val="center"/>
           </w:tcPr>
           <w:p>
             <w:r/>
@@ -1435,8 +1460,8 @@
         <w:tc>
           <w:tcPr>
             <w:tcW w:type="dxa" w:w="3120"/>
+            <w:vAlign w:val="center"/>
             <w:shd w:fill="F2F4F7"/>
-            <w:vAlign w:val="center"/>
           </w:tcPr>
           <w:p>
             <w:r/>
@@ -1499,7 +1524,60 @@
                 <w:b w:val="0"/>
                 <w:sz w:val="18"/>
               </w:rPr>
-              <w:t>Direct Exchange central do fluxo</w:t>
+              <w:t>Direct Exchange central do fluxo de pedido</w:t>
+            </w:r>
+          </w:p>
+        </w:tc>
+      </w:tr>
+      <w:tr>
+        <w:tc>
+          <w:tcPr>
+            <w:tcW w:type="dxa" w:w="3120"/>
+            <w:vAlign w:val="center"/>
+          </w:tcPr>
+          <w:p>
+            <w:r/>
+            <w:r>
+              <w:rPr>
+                <w:rFonts w:ascii="Calibri" w:hAnsi="Calibri"/>
+                <w:b w:val="0"/>
+                <w:sz w:val="18"/>
+              </w:rPr>
+              <w:t>Exchange</w:t>
+            </w:r>
+          </w:p>
+        </w:tc>
+        <w:tc>
+          <w:tcPr>
+            <w:tcW w:type="dxa" w:w="3120"/>
+            <w:vAlign w:val="center"/>
+          </w:tcPr>
+          <w:p>
+            <w:r/>
+            <w:r>
+              <w:rPr>
+                <w:rFonts w:ascii="Calibri" w:hAnsi="Calibri"/>
+                <w:b w:val="0"/>
+                <w:sz w:val="18"/>
+              </w:rPr>
+              <w:t>commerce.auditoria.topic.exchange</w:t>
+            </w:r>
+          </w:p>
+        </w:tc>
+        <w:tc>
+          <w:tcPr>
+            <w:tcW w:type="dxa" w:w="3120"/>
+            <w:vAlign w:val="center"/>
+          </w:tcPr>
+          <w:p>
+            <w:r/>
+            <w:r>
+              <w:rPr>
+                <w:rFonts w:ascii="Calibri" w:hAnsi="Calibri"/>
+                <w:b w:val="0"/>
+                <w:sz w:val="18"/>
+              </w:rPr>
+              <w:t>Topic Exchange para auditoria</w:t>
             </w:r>
           </w:p>
         </w:tc>
@@ -1624,6 +1702,59 @@
                 <w:b w:val="0"/>
                 <w:sz w:val="18"/>
               </w:rPr>
+              <w:t>Fila</w:t>
+            </w:r>
+          </w:p>
+        </w:tc>
+        <w:tc>
+          <w:tcPr>
+            <w:tcW w:type="dxa" w:w="3120"/>
+            <w:vAlign w:val="center"/>
+          </w:tcPr>
+          <w:p>
+            <w:r/>
+            <w:r>
+              <w:rPr>
+                <w:rFonts w:ascii="Calibri" w:hAnsi="Calibri"/>
+                <w:b w:val="0"/>
+                <w:sz w:val="18"/>
+              </w:rPr>
+              <w:t>commerce.auditoria.pedido.queue</w:t>
+            </w:r>
+          </w:p>
+        </w:tc>
+        <w:tc>
+          <w:tcPr>
+            <w:tcW w:type="dxa" w:w="3120"/>
+            <w:vAlign w:val="center"/>
+          </w:tcPr>
+          <w:p>
+            <w:r/>
+            <w:r>
+              <w:rPr>
+                <w:rFonts w:ascii="Calibri" w:hAnsi="Calibri"/>
+                <w:b w:val="0"/>
+                <w:sz w:val="18"/>
+              </w:rPr>
+              <w:t>Consumida pelo listener de auditoria</w:t>
+            </w:r>
+          </w:p>
+        </w:tc>
+      </w:tr>
+      <w:tr>
+        <w:tc>
+          <w:tcPr>
+            <w:tcW w:type="dxa" w:w="3120"/>
+            <w:vAlign w:val="center"/>
+          </w:tcPr>
+          <w:p>
+            <w:r/>
+            <w:r>
+              <w:rPr>
+                <w:rFonts w:ascii="Calibri" w:hAnsi="Calibri"/>
+                <w:b w:val="0"/>
+                <w:sz w:val="18"/>
+              </w:rPr>
               <w:t>Routing key</w:t>
             </w:r>
           </w:p>
@@ -1716,6 +1847,112 @@
           </w:p>
         </w:tc>
       </w:tr>
+      <w:tr>
+        <w:tc>
+          <w:tcPr>
+            <w:tcW w:type="dxa" w:w="3120"/>
+            <w:vAlign w:val="center"/>
+          </w:tcPr>
+          <w:p>
+            <w:r/>
+            <w:r>
+              <w:rPr>
+                <w:rFonts w:ascii="Calibri" w:hAnsi="Calibri"/>
+                <w:b w:val="0"/>
+                <w:sz w:val="18"/>
+              </w:rPr>
+              <w:t>Routing key</w:t>
+            </w:r>
+          </w:p>
+        </w:tc>
+        <w:tc>
+          <w:tcPr>
+            <w:tcW w:type="dxa" w:w="3120"/>
+            <w:vAlign w:val="center"/>
+          </w:tcPr>
+          <w:p>
+            <w:r/>
+            <w:r>
+              <w:rPr>
+                <w:rFonts w:ascii="Calibri" w:hAnsi="Calibri"/>
+                <w:b w:val="0"/>
+                <w:sz w:val="18"/>
+              </w:rPr>
+              <w:t>pedido.sem-resposta-estoque</w:t>
+            </w:r>
+          </w:p>
+        </w:tc>
+        <w:tc>
+          <w:tcPr>
+            <w:tcW w:type="dxa" w:w="3120"/>
+            <w:vAlign w:val="center"/>
+          </w:tcPr>
+          <w:p>
+            <w:r/>
+            <w:r>
+              <w:rPr>
+                <w:rFonts w:ascii="Calibri" w:hAnsi="Calibri"/>
+                <w:b w:val="0"/>
+                <w:sz w:val="18"/>
+              </w:rPr>
+              <w:t>Roteia auditorias de pedido sem resposta</w:t>
+            </w:r>
+          </w:p>
+        </w:tc>
+      </w:tr>
+      <w:tr>
+        <w:tc>
+          <w:tcPr>
+            <w:tcW w:type="dxa" w:w="3120"/>
+            <w:vAlign w:val="center"/>
+          </w:tcPr>
+          <w:p>
+            <w:r/>
+            <w:r>
+              <w:rPr>
+                <w:rFonts w:ascii="Calibri" w:hAnsi="Calibri"/>
+                <w:b w:val="0"/>
+                <w:sz w:val="18"/>
+              </w:rPr>
+              <w:t>Binding topic</w:t>
+            </w:r>
+          </w:p>
+        </w:tc>
+        <w:tc>
+          <w:tcPr>
+            <w:tcW w:type="dxa" w:w="3120"/>
+            <w:vAlign w:val="center"/>
+          </w:tcPr>
+          <w:p>
+            <w:r/>
+            <w:r>
+              <w:rPr>
+                <w:rFonts w:ascii="Calibri" w:hAnsi="Calibri"/>
+                <w:b w:val="0"/>
+                <w:sz w:val="18"/>
+              </w:rPr>
+              <w:t>pedido.#</w:t>
+            </w:r>
+          </w:p>
+        </w:tc>
+        <w:tc>
+          <w:tcPr>
+            <w:tcW w:type="dxa" w:w="3120"/>
+            <w:vAlign w:val="center"/>
+          </w:tcPr>
+          <w:p>
+            <w:r/>
+            <w:r>
+              <w:rPr>
+                <w:rFonts w:ascii="Calibri" w:hAnsi="Calibri"/>
+                <w:b w:val="0"/>
+                <w:sz w:val="18"/>
+              </w:rPr>
+              <w:t>Recebe eventos de auditoria iniciados por pedido</w:t>
+            </w:r>
+          </w:p>
+        </w:tc>
+      </w:tr>
     </w:tbl>
     <w:p/>
     <w:p>
@@ -1738,7 +1975,6 @@
       <w:tblPr>
         <w:tblStyle w:val="TableGrid"/>
         <w:tblW w:type="auto" w:w="0"/>
-        <w:tblLayout w:type="autofit"/>
         <w:tblLook w:firstColumn="1" w:firstRow="1" w:lastColumn="0" w:lastRow="0" w:noHBand="0" w:noVBand="1" w:val="04A0"/>
       </w:tblPr>
       <w:tblGrid>
@@ -1750,8 +1986,8 @@
         <w:tc>
           <w:tcPr>
             <w:tcW w:type="dxa" w:w="3120"/>
+            <w:vAlign w:val="center"/>
             <w:shd w:fill="F2F4F7"/>
-            <w:vAlign w:val="center"/>
           </w:tcPr>
           <w:p>
             <w:r/>
@@ -1768,8 +2004,8 @@
         <w:tc>
           <w:tcPr>
             <w:tcW w:type="dxa" w:w="3120"/>
+            <w:vAlign w:val="center"/>
             <w:shd w:fill="F2F4F7"/>
-            <w:vAlign w:val="center"/>
           </w:tcPr>
           <w:p>
             <w:r/>
@@ -1786,8 +2022,8 @@
         <w:tc>
           <w:tcPr>
             <w:tcW w:type="dxa" w:w="3120"/>
+            <w:vAlign w:val="center"/>
             <w:shd w:fill="F2F4F7"/>
-            <w:vAlign w:val="center"/>
           </w:tcPr>
           <w:p>
             <w:r/>
@@ -2131,15 +2367,7 @@
           <w:rFonts w:ascii="Consolas" w:hAnsi="Consolas"/>
           <w:sz w:val="18"/>
         </w:rPr>
-        <w:t>{</w:t>
-        <w:br/>
-        <w:t xml:space="preserve">  "pedidoId": 10,</w:t>
-        <w:br/>
-        <w:t xml:space="preserve">  "valorTotal": 99.90,</w:t>
-        <w:br/>
-        <w:t xml:space="preserve">  "itens": [{"produtoId": 1, "quantidade": 1}]</w:t>
-        <w:br/>
-        <w:t>}</w:t>
+        <w:t>{"pedidoId":10,"valorTotal":99.90,"itens":[{"produtoId":1,"quantidade":1}]}</w:t>
       </w:r>
     </w:p>
     <w:p>
@@ -2154,7 +2382,6 @@
       <w:tblPr>
         <w:tblStyle w:val="TableGrid"/>
         <w:tblW w:type="auto" w:w="0"/>
-        <w:tblLayout w:type="autofit"/>
         <w:tblLook w:firstColumn="1" w:firstRow="1" w:lastColumn="0" w:lastRow="0" w:noHBand="0" w:noVBand="1" w:val="04A0"/>
       </w:tblPr>
       <w:tblGrid>
@@ -2166,8 +2393,8 @@
         <w:tc>
           <w:tcPr>
             <w:tcW w:type="dxa" w:w="3120"/>
+            <w:vAlign w:val="center"/>
             <w:shd w:fill="F2F4F7"/>
-            <w:vAlign w:val="center"/>
           </w:tcPr>
           <w:p>
             <w:r/>
@@ -2184,8 +2411,8 @@
         <w:tc>
           <w:tcPr>
             <w:tcW w:type="dxa" w:w="3120"/>
+            <w:vAlign w:val="center"/>
             <w:shd w:fill="F2F4F7"/>
-            <w:vAlign w:val="center"/>
           </w:tcPr>
           <w:p>
             <w:r/>
@@ -2202,8 +2429,8 @@
         <w:tc>
           <w:tcPr>
             <w:tcW w:type="dxa" w:w="3120"/>
+            <w:vAlign w:val="center"/>
             <w:shd w:fill="F2F4F7"/>
-            <w:vAlign w:val="center"/>
           </w:tcPr>
           <w:p>
             <w:r/>
@@ -2494,19 +2721,356 @@
           <w:rFonts w:ascii="Consolas" w:hAnsi="Consolas"/>
           <w:sz w:val="18"/>
         </w:rPr>
-        <w:t>{</w:t>
-        <w:br/>
-        <w:t xml:space="preserve">  "pedidoId": 10,</w:t>
-        <w:br/>
-        <w:t xml:space="preserve">  "sucesso": true,</w:t>
-        <w:br/>
-        <w:t xml:space="preserve">  "status": "PROCESSADO",</w:t>
-        <w:br/>
-        <w:t xml:space="preserve">  "mensagem": "Estoque baixado com sucesso."</w:t>
-        <w:br/>
-        <w:t>}</w:t>
+        <w:t>{"pedidoId":10,"sucesso":true,"status":"PROCESSADO","mensagem":"Estoque baixado com sucesso."}</w:t>
       </w:r>
     </w:p>
+    <w:p>
+      <w:pPr>
+        <w:pStyle w:val="Heading2"/>
+      </w:pPr>
+      <w:r>
+        <w:t>6.3 pedido.sem-resposta-estoque</w:t>
+      </w:r>
+    </w:p>
+    <w:p>
+      <w:r>
+        <w:t>Publicado pelo servico pedido quando um pedido permanece PROCESSANDO por mais de 30 segundos sem receber resposta do estoque.</w:t>
+      </w:r>
+    </w:p>
+    <w:tbl>
+      <w:tblPr>
+        <w:tblStyle w:val="TableGrid"/>
+        <w:tblW w:type="auto" w:w="0"/>
+        <w:tblLook w:firstColumn="1" w:firstRow="1" w:lastColumn="0" w:lastRow="0" w:noHBand="0" w:noVBand="1" w:val="04A0"/>
+      </w:tblPr>
+      <w:tblGrid>
+        <w:gridCol w:w="3120"/>
+        <w:gridCol w:w="3120"/>
+        <w:gridCol w:w="3120"/>
+      </w:tblGrid>
+      <w:tr>
+        <w:tc>
+          <w:tcPr>
+            <w:tcW w:type="dxa" w:w="3120"/>
+            <w:vAlign w:val="center"/>
+            <w:shd w:fill="F2F4F7"/>
+          </w:tcPr>
+          <w:p>
+            <w:r/>
+            <w:r>
+              <w:rPr>
+                <w:rFonts w:ascii="Calibri" w:hAnsi="Calibri"/>
+                <w:b/>
+                <w:sz w:val="18"/>
+              </w:rPr>
+              <w:t>Campo</w:t>
+            </w:r>
+          </w:p>
+        </w:tc>
+        <w:tc>
+          <w:tcPr>
+            <w:tcW w:type="dxa" w:w="3120"/>
+            <w:vAlign w:val="center"/>
+            <w:shd w:fill="F2F4F7"/>
+          </w:tcPr>
+          <w:p>
+            <w:r/>
+            <w:r>
+              <w:rPr>
+                <w:rFonts w:ascii="Calibri" w:hAnsi="Calibri"/>
+                <w:b/>
+                <w:sz w:val="18"/>
+              </w:rPr>
+              <w:t>Tipo</w:t>
+            </w:r>
+          </w:p>
+        </w:tc>
+        <w:tc>
+          <w:tcPr>
+            <w:tcW w:type="dxa" w:w="3120"/>
+            <w:vAlign w:val="center"/>
+            <w:shd w:fill="F2F4F7"/>
+          </w:tcPr>
+          <w:p>
+            <w:r/>
+            <w:r>
+              <w:rPr>
+                <w:rFonts w:ascii="Calibri" w:hAnsi="Calibri"/>
+                <w:b/>
+                <w:sz w:val="18"/>
+              </w:rPr>
+              <w:t>Descricao</w:t>
+            </w:r>
+          </w:p>
+        </w:tc>
+      </w:tr>
+      <w:tr>
+        <w:tc>
+          <w:tcPr>
+            <w:tcW w:type="dxa" w:w="3120"/>
+            <w:vAlign w:val="center"/>
+          </w:tcPr>
+          <w:p>
+            <w:r/>
+            <w:r>
+              <w:rPr>
+                <w:rFonts w:ascii="Calibri" w:hAnsi="Calibri"/>
+                <w:b w:val="0"/>
+                <w:sz w:val="18"/>
+              </w:rPr>
+              <w:t>pedidoId</w:t>
+            </w:r>
+          </w:p>
+        </w:tc>
+        <w:tc>
+          <w:tcPr>
+            <w:tcW w:type="dxa" w:w="3120"/>
+            <w:vAlign w:val="center"/>
+          </w:tcPr>
+          <w:p>
+            <w:r/>
+            <w:r>
+              <w:rPr>
+                <w:rFonts w:ascii="Calibri" w:hAnsi="Calibri"/>
+                <w:b w:val="0"/>
+                <w:sz w:val="18"/>
+              </w:rPr>
+              <w:t>Long</w:t>
+            </w:r>
+          </w:p>
+        </w:tc>
+        <w:tc>
+          <w:tcPr>
+            <w:tcW w:type="dxa" w:w="3120"/>
+            <w:vAlign w:val="center"/>
+          </w:tcPr>
+          <w:p>
+            <w:r/>
+            <w:r>
+              <w:rPr>
+                <w:rFonts w:ascii="Calibri" w:hAnsi="Calibri"/>
+                <w:b w:val="0"/>
+                <w:sz w:val="18"/>
+              </w:rPr>
+              <w:t>Pedido auditado</w:t>
+            </w:r>
+          </w:p>
+        </w:tc>
+      </w:tr>
+      <w:tr>
+        <w:tc>
+          <w:tcPr>
+            <w:tcW w:type="dxa" w:w="3120"/>
+            <w:vAlign w:val="center"/>
+          </w:tcPr>
+          <w:p>
+            <w:r/>
+            <w:r>
+              <w:rPr>
+                <w:rFonts w:ascii="Calibri" w:hAnsi="Calibri"/>
+                <w:b w:val="0"/>
+                <w:sz w:val="18"/>
+              </w:rPr>
+              <w:t>statusAtual</w:t>
+            </w:r>
+          </w:p>
+        </w:tc>
+        <w:tc>
+          <w:tcPr>
+            <w:tcW w:type="dxa" w:w="3120"/>
+            <w:vAlign w:val="center"/>
+          </w:tcPr>
+          <w:p>
+            <w:r/>
+            <w:r>
+              <w:rPr>
+                <w:rFonts w:ascii="Calibri" w:hAnsi="Calibri"/>
+                <w:b w:val="0"/>
+                <w:sz w:val="18"/>
+              </w:rPr>
+              <w:t>String</w:t>
+            </w:r>
+          </w:p>
+        </w:tc>
+        <w:tc>
+          <w:tcPr>
+            <w:tcW w:type="dxa" w:w="3120"/>
+            <w:vAlign w:val="center"/>
+          </w:tcPr>
+          <w:p>
+            <w:r/>
+            <w:r>
+              <w:rPr>
+                <w:rFonts w:ascii="Calibri" w:hAnsi="Calibri"/>
+                <w:b w:val="0"/>
+                <w:sz w:val="18"/>
+              </w:rPr>
+              <w:t>Status no momento da auditoria</w:t>
+            </w:r>
+          </w:p>
+        </w:tc>
+      </w:tr>
+      <w:tr>
+        <w:tc>
+          <w:tcPr>
+            <w:tcW w:type="dxa" w:w="3120"/>
+            <w:vAlign w:val="center"/>
+          </w:tcPr>
+          <w:p>
+            <w:r/>
+            <w:r>
+              <w:rPr>
+                <w:rFonts w:ascii="Calibri" w:hAnsi="Calibri"/>
+                <w:b w:val="0"/>
+                <w:sz w:val="18"/>
+              </w:rPr>
+              <w:t>motivo</w:t>
+            </w:r>
+          </w:p>
+        </w:tc>
+        <w:tc>
+          <w:tcPr>
+            <w:tcW w:type="dxa" w:w="3120"/>
+            <w:vAlign w:val="center"/>
+          </w:tcPr>
+          <w:p>
+            <w:r/>
+            <w:r>
+              <w:rPr>
+                <w:rFonts w:ascii="Calibri" w:hAnsi="Calibri"/>
+                <w:b w:val="0"/>
+                <w:sz w:val="18"/>
+              </w:rPr>
+              <w:t>String</w:t>
+            </w:r>
+          </w:p>
+        </w:tc>
+        <w:tc>
+          <w:tcPr>
+            <w:tcW w:type="dxa" w:w="3120"/>
+            <w:vAlign w:val="center"/>
+          </w:tcPr>
+          <w:p>
+            <w:r/>
+            <w:r>
+              <w:rPr>
+                <w:rFonts w:ascii="Calibri" w:hAnsi="Calibri"/>
+                <w:b w:val="0"/>
+                <w:sz w:val="18"/>
+              </w:rPr>
+              <w:t>Explicacao da auditoria</w:t>
+            </w:r>
+          </w:p>
+        </w:tc>
+      </w:tr>
+      <w:tr>
+        <w:tc>
+          <w:tcPr>
+            <w:tcW w:type="dxa" w:w="3120"/>
+            <w:vAlign w:val="center"/>
+          </w:tcPr>
+          <w:p>
+            <w:r/>
+            <w:r>
+              <w:rPr>
+                <w:rFonts w:ascii="Calibri" w:hAnsi="Calibri"/>
+                <w:b w:val="0"/>
+                <w:sz w:val="18"/>
+              </w:rPr>
+              <w:t>criadoEm</w:t>
+            </w:r>
+          </w:p>
+        </w:tc>
+        <w:tc>
+          <w:tcPr>
+            <w:tcW w:type="dxa" w:w="3120"/>
+            <w:vAlign w:val="center"/>
+          </w:tcPr>
+          <w:p>
+            <w:r/>
+            <w:r>
+              <w:rPr>
+                <w:rFonts w:ascii="Calibri" w:hAnsi="Calibri"/>
+                <w:b w:val="0"/>
+                <w:sz w:val="18"/>
+              </w:rPr>
+              <w:t>LocalDateTime</w:t>
+            </w:r>
+          </w:p>
+        </w:tc>
+        <w:tc>
+          <w:tcPr>
+            <w:tcW w:type="dxa" w:w="3120"/>
+            <w:vAlign w:val="center"/>
+          </w:tcPr>
+          <w:p>
+            <w:r/>
+            <w:r>
+              <w:rPr>
+                <w:rFonts w:ascii="Calibri" w:hAnsi="Calibri"/>
+                <w:b w:val="0"/>
+                <w:sz w:val="18"/>
+              </w:rPr>
+              <w:t>Data/hora de criacao</w:t>
+            </w:r>
+          </w:p>
+        </w:tc>
+      </w:tr>
+      <w:tr>
+        <w:tc>
+          <w:tcPr>
+            <w:tcW w:type="dxa" w:w="3120"/>
+            <w:vAlign w:val="center"/>
+          </w:tcPr>
+          <w:p>
+            <w:r/>
+            <w:r>
+              <w:rPr>
+                <w:rFonts w:ascii="Calibri" w:hAnsi="Calibri"/>
+                <w:b w:val="0"/>
+                <w:sz w:val="18"/>
+              </w:rPr>
+              <w:t>auditadoEm</w:t>
+            </w:r>
+          </w:p>
+        </w:tc>
+        <w:tc>
+          <w:tcPr>
+            <w:tcW w:type="dxa" w:w="3120"/>
+            <w:vAlign w:val="center"/>
+          </w:tcPr>
+          <w:p>
+            <w:r/>
+            <w:r>
+              <w:rPr>
+                <w:rFonts w:ascii="Calibri" w:hAnsi="Calibri"/>
+                <w:b w:val="0"/>
+                <w:sz w:val="18"/>
+              </w:rPr>
+              <w:t>LocalDateTime</w:t>
+            </w:r>
+          </w:p>
+        </w:tc>
+        <w:tc>
+          <w:tcPr>
+            <w:tcW w:type="dxa" w:w="3120"/>
+            <w:vAlign w:val="center"/>
+          </w:tcPr>
+          <w:p>
+            <w:r/>
+            <w:r>
+              <w:rPr>
+                <w:rFonts w:ascii="Calibri" w:hAnsi="Calibri"/>
+                <w:b w:val="0"/>
+                <w:sz w:val="18"/>
+              </w:rPr>
+              <w:t>Data/hora da auditoria</w:t>
+            </w:r>
+          </w:p>
+        </w:tc>
+      </w:tr>
+    </w:tbl>
+    <w:p/>
     <w:p>
       <w:pPr>
         <w:pStyle w:val="Heading1"/>
@@ -2519,7 +3083,6 @@
       <w:tblPr>
         <w:tblStyle w:val="TableGrid"/>
         <w:tblW w:type="auto" w:w="0"/>
-        <w:tblLayout w:type="autofit"/>
         <w:tblLook w:firstColumn="1" w:firstRow="1" w:lastColumn="0" w:lastRow="0" w:noHBand="0" w:noVBand="1" w:val="04A0"/>
       </w:tblPr>
       <w:tblGrid>
@@ -2532,8 +3095,8 @@
         <w:tc>
           <w:tcPr>
             <w:tcW w:type="dxa" w:w="2340"/>
+            <w:vAlign w:val="center"/>
             <w:shd w:fill="F2F4F7"/>
-            <w:vAlign w:val="center"/>
           </w:tcPr>
           <w:p>
             <w:r/>
@@ -2550,8 +3113,8 @@
         <w:tc>
           <w:tcPr>
             <w:tcW w:type="dxa" w:w="2340"/>
+            <w:vAlign w:val="center"/>
             <w:shd w:fill="F2F4F7"/>
-            <w:vAlign w:val="center"/>
           </w:tcPr>
           <w:p>
             <w:r/>
@@ -2568,8 +3131,8 @@
         <w:tc>
           <w:tcPr>
             <w:tcW w:type="dxa" w:w="2340"/>
+            <w:vAlign w:val="center"/>
             <w:shd w:fill="F2F4F7"/>
-            <w:vAlign w:val="center"/>
           </w:tcPr>
           <w:p>
             <w:r/>
@@ -2586,8 +3149,8 @@
         <w:tc>
           <w:tcPr>
             <w:tcW w:type="dxa" w:w="2340"/>
+            <w:vAlign w:val="center"/>
             <w:shd w:fill="F2F4F7"/>
-            <w:vAlign w:val="center"/>
           </w:tcPr>
           <w:p>
             <w:r/>
@@ -3605,7 +4168,7 @@
         <w:pStyle w:val="ListBullet"/>
       </w:pPr>
       <w:r>
-        <w:t>Subir RabbitMQ com docker compose na raiz do projeto ou com docker run.</w:t>
+        <w:t>Subir RabbitMQ com Docker Compose na raiz do projeto ou com docker run.</w:t>
       </w:r>
     </w:p>
     <w:p>
@@ -3674,7 +4237,6 @@
       <w:tblPr>
         <w:tblStyle w:val="TableGrid"/>
         <w:tblW w:type="auto" w:w="0"/>
-        <w:tblLayout w:type="autofit"/>
         <w:tblLook w:firstColumn="1" w:firstRow="1" w:lastColumn="0" w:lastRow="0" w:noHBand="0" w:noVBand="1" w:val="04A0"/>
       </w:tblPr>
       <w:tblGrid>
@@ -3685,8 +4247,8 @@
         <w:tc>
           <w:tcPr>
             <w:tcW w:type="dxa" w:w="4680"/>
+            <w:vAlign w:val="center"/>
             <w:shd w:fill="F2F4F7"/>
-            <w:vAlign w:val="center"/>
           </w:tcPr>
           <w:p>
             <w:r/>
@@ -3703,8 +4265,8 @@
         <w:tc>
           <w:tcPr>
             <w:tcW w:type="dxa" w:w="4680"/>
+            <w:vAlign w:val="center"/>
             <w:shd w:fill="F2F4F7"/>
-            <w:vAlign w:val="center"/>
           </w:tcPr>
           <w:p>
             <w:r/>
@@ -4038,7 +4600,7 @@
                 <w:b w:val="0"/>
                 <w:sz w:val="18"/>
               </w:rPr>
-              <w:t>Parcial; Direct Exchange implementada</w:t>
+              <w:t>Atendido; DirectExchange e TopicExchange</w:t>
             </w:r>
           </w:p>
         </w:tc>
@@ -4074,7 +4636,7 @@
                 <w:b w:val="0"/>
                 <w:sz w:val="18"/>
               </w:rPr>
-              <w:t>Parcial; logs padrao do Spring/Docker</w:t>
+              <w:t>Parcial; auditoria possui logs explicitos</w:t>
             </w:r>
           </w:p>
         </w:tc>
@@ -4096,7 +4658,7 @@
     </w:p>
     <w:p>
       <w:r>
-        <w:t>As principais melhorias futuras sao adicionar um segundo tipo de exchange, inserir logs explicitos nos produtores/consumidores e evoluir a persistencia conforme os requisitos finais da disciplina.</w:t>
+        <w:t>A implementacao tambem inclui uma TopicExchange para auditoria de pedidos que permanecem sem resposta do estoque, atendendo ao criterio de uso de mais de um tipo de exchange.</w:t>
       </w:r>
     </w:p>
     <w:sectPr>

</xml_diff>

<commit_message>
Commit Versão final arquitetura romulo
</commit_message>
<xml_diff>
--- a/docs/01-documentacao-arquitetural.docx
+++ b/docs/01-documentacao-arquitetural.docx
@@ -17,7 +17,7 @@
         <w:jc w:val="center"/>
       </w:pPr>
       <w:r>
-        <w:t>Documentacao arquitetural</w:t>
+        <w:t>Documentação arquitetural</w:t>
       </w:r>
     </w:p>
     <w:tbl>
@@ -56,14 +56,8 @@
             <w:shd w:fill="F2F4F7"/>
           </w:tcPr>
           <w:p>
-            <w:r/>
             <w:r>
-              <w:rPr>
-                <w:rFonts w:ascii="Calibri" w:hAnsi="Calibri"/>
-                <w:b/>
-                <w:sz w:val="18"/>
-              </w:rPr>
-              <w:t>Descricao</w:t>
+              <w:t>Descrição</w:t>
             </w:r>
           </w:p>
         </w:tc>
@@ -92,14 +86,8 @@
             <w:vAlign w:val="center"/>
           </w:tcPr>
           <w:p>
-            <w:r/>
             <w:r>
-              <w:rPr>
-                <w:rFonts w:ascii="Calibri" w:hAnsi="Calibri"/>
-                <w:b w:val="0"/>
-                <w:sz w:val="18"/>
-              </w:rPr>
-              <w:t>Sistemas Baseados em Eventos e Mensageria Distribuida</w:t>
+              <w:t>Sistemas Baseados em Eventos e Mensageria Distribuída</w:t>
             </w:r>
           </w:p>
         </w:tc>
@@ -128,14 +116,8 @@
             <w:vAlign w:val="center"/>
           </w:tcPr>
           <w:p>
-            <w:r/>
             <w:r>
-              <w:rPr>
-                <w:rFonts w:ascii="Calibri" w:hAnsi="Calibri"/>
-                <w:b w:val="0"/>
-                <w:sz w:val="18"/>
-              </w:rPr>
-              <w:t>Romulo F. Douro</w:t>
+              <w:t>Rômulo F. Douro</w:t>
             </w:r>
           </w:p>
         </w:tc>
@@ -200,14 +182,8 @@
             <w:vAlign w:val="center"/>
           </w:tcPr>
           <w:p>
-            <w:r/>
             <w:r>
-              <w:rPr>
-                <w:rFonts w:ascii="Calibri" w:hAnsi="Calibri"/>
-                <w:b w:val="0"/>
-                <w:sz w:val="18"/>
-              </w:rPr>
-              <w:t>Repositorio GitHub</w:t>
+              <w:t>Repositório GitHub</w:t>
             </w:r>
           </w:p>
         </w:tc>
@@ -255,22 +231,22 @@
         <w:pStyle w:val="Heading1"/>
       </w:pPr>
       <w:r>
-        <w:t>1. Introducao</w:t>
+        <w:t>1. Introdução</w:t>
       </w:r>
     </w:p>
     <w:p>
       <w:r>
-        <w:t>O Cloud Commerce e um projeto didatico de e-commerce desenvolvido para aplicar conceitos de Arquitetura Orientada a Eventos (EDA), microservicos, mensageria assincrona e containerizacao.</w:t>
+        <w:t>O Cloud Commerce é um projeto didático de e-commerce desenvolvido para aplicar conceitos de Arquitetura Orientada a Eventos (EDA), microsserviços, mensageria assíncrona e conteinerização.</w:t>
       </w:r>
     </w:p>
     <w:p>
       <w:r>
-        <w:t>O fluxo escolhido foi a criacao de pedidos com validacao de estoque. O servico de pedido publica um evento no RabbitMQ, o servico de estoque consome esse evento, valida disponibilidade, baixa a quantidade quando possivel e publica uma resposta para atualizacao do status do pedido.</w:t>
+        <w:t>O fluxo escolhido foi a criação de pedidos com validação de estoque. O serviço de pedido publica um evento no RabbitMQ, o serviço de estoque consome esse evento, valida disponibilidade, baixa a quantidade quando possível e publica uma resposta para atualização do status do pedido.</w:t>
       </w:r>
     </w:p>
     <w:p>
       <w:r>
-        <w:t>O enunciado sugere H2 ou SQLite. Neste projeto foi mantido Supabase/PostgreSQL porque a aplicacao ja havia sido criada dessa forma antes da adequacao ao trabalho.</w:t>
+        <w:t>O enunciado sugere H2 ou SQLite. Neste projeto foi mantido Supabase/PostgreSQL porque a aplicação já havia sido criada dessa forma antes da adequação ao trabalho.</w:t>
       </w:r>
     </w:p>
     <w:p>
@@ -353,14 +329,8 @@
             <w:vAlign w:val="center"/>
           </w:tcPr>
           <w:p>
-            <w:r/>
             <w:r>
-              <w:rPr>
-                <w:rFonts w:ascii="Calibri" w:hAnsi="Calibri"/>
-                <w:b w:val="0"/>
-                <w:sz w:val="18"/>
-              </w:rPr>
-              <w:t>Linguagem dos servicos</w:t>
+              <w:t>Linguagem dos serviços</w:t>
             </w:r>
           </w:p>
         </w:tc>
@@ -389,14 +359,8 @@
             <w:vAlign w:val="center"/>
           </w:tcPr>
           <w:p>
-            <w:r/>
             <w:r>
-              <w:rPr>
-                <w:rFonts w:ascii="Calibri" w:hAnsi="Calibri"/>
-                <w:b w:val="0"/>
-                <w:sz w:val="18"/>
-              </w:rPr>
-              <w:t>APIs REST e aplicacao web</w:t>
+              <w:t>APIs REST e aplicação web</w:t>
             </w:r>
           </w:p>
         </w:tc>
@@ -425,14 +389,8 @@
             <w:vAlign w:val="center"/>
           </w:tcPr>
           <w:p>
-            <w:r/>
             <w:r>
-              <w:rPr>
-                <w:rFonts w:ascii="Calibri" w:hAnsi="Calibri"/>
-                <w:b w:val="0"/>
-                <w:sz w:val="18"/>
-              </w:rPr>
-              <w:t>Exposicao dos endpoints</w:t>
+              <w:t>Exposição dos endpoints</w:t>
             </w:r>
           </w:p>
         </w:tc>
@@ -461,14 +419,8 @@
             <w:vAlign w:val="center"/>
           </w:tcPr>
           <w:p>
-            <w:r/>
             <w:r>
-              <w:rPr>
-                <w:rFonts w:ascii="Calibri" w:hAnsi="Calibri"/>
-                <w:b w:val="0"/>
-                <w:sz w:val="18"/>
-              </w:rPr>
-              <w:t>Persistencia</w:t>
+              <w:t>Persistência</w:t>
             </w:r>
           </w:p>
         </w:tc>
@@ -497,14 +449,8 @@
             <w:vAlign w:val="center"/>
           </w:tcPr>
           <w:p>
-            <w:r/>
             <w:r>
-              <w:rPr>
-                <w:rFonts w:ascii="Calibri" w:hAnsi="Calibri"/>
-                <w:b w:val="0"/>
-                <w:sz w:val="18"/>
-              </w:rPr>
-              <w:t>Integracao com RabbitMQ</w:t>
+              <w:t>Integração com RabbitMQ</w:t>
             </w:r>
           </w:p>
         </w:tc>
@@ -605,14 +551,8 @@
             <w:vAlign w:val="center"/>
           </w:tcPr>
           <w:p>
-            <w:r/>
             <w:r>
-              <w:rPr>
-                <w:rFonts w:ascii="Calibri" w:hAnsi="Calibri"/>
-                <w:b w:val="0"/>
-                <w:sz w:val="18"/>
-              </w:rPr>
-              <w:t>Execucao local do RabbitMQ</w:t>
+              <w:t>Execução local do RabbitMQ</w:t>
             </w:r>
           </w:p>
         </w:tc>
@@ -677,14 +617,8 @@
             <w:vAlign w:val="center"/>
           </w:tcPr>
           <w:p>
-            <w:r/>
             <w:r>
-              <w:rPr>
-                <w:rFonts w:ascii="Calibri" w:hAnsi="Calibri"/>
-                <w:b w:val="0"/>
-                <w:sz w:val="18"/>
-              </w:rPr>
-              <w:t>Build dos servicos</w:t>
+              <w:t>Build dos serviços</w:t>
             </w:r>
           </w:p>
         </w:tc>
@@ -718,14 +652,8 @@
             <w:shd w:fill="F2F4F7"/>
           </w:tcPr>
           <w:p>
-            <w:r/>
             <w:r>
-              <w:rPr>
-                <w:rFonts w:ascii="Calibri" w:hAnsi="Calibri"/>
-                <w:b/>
-                <w:sz w:val="18"/>
-              </w:rPr>
-              <w:t>Servico</w:t>
+              <w:t>Serviço</w:t>
             </w:r>
           </w:p>
         </w:tc>
@@ -860,14 +788,8 @@
             <w:vAlign w:val="center"/>
           </w:tcPr>
           <w:p>
-            <w:r/>
             <w:r>
-              <w:rPr>
-                <w:rFonts w:ascii="Calibri" w:hAnsi="Calibri"/>
-                <w:b w:val="0"/>
-                <w:sz w:val="18"/>
-              </w:rPr>
-              <w:t>Catalogo de produtos</w:t>
+              <w:t>Catálogo de produtos</w:t>
             </w:r>
           </w:p>
         </w:tc>
@@ -966,14 +888,8 @@
             <w:vAlign w:val="center"/>
           </w:tcPr>
           <w:p>
-            <w:r/>
             <w:r>
-              <w:rPr>
-                <w:rFonts w:ascii="Calibri" w:hAnsi="Calibri"/>
-                <w:b w:val="0"/>
-                <w:sz w:val="18"/>
-              </w:rPr>
-              <w:t>Criacao, status e auditoria de pedidos</w:t>
+              <w:t>Criação, status e auditoria de pedidos</w:t>
             </w:r>
           </w:p>
         </w:tc>
@@ -1038,11 +954,7 @@
         <w:pStyle w:val="CodeBlock"/>
       </w:pPr>
       <w:r>
-        <w:rPr>
-          <w:rFonts w:ascii="Consolas" w:hAnsi="Consolas"/>
-          <w:sz w:val="18"/>
-        </w:rPr>
-        <w:t>Usuario -&gt; cloud-commerce</w:t>
+        <w:t>Usuário -&gt; cloud-commerce</w:t>
         <w:br/>
         <w:t>cloud-commerce -&gt; produto/estoque/pedido via HTTP</w:t>
         <w:br/>
@@ -1060,7 +972,7 @@
         <w:pStyle w:val="Heading1"/>
       </w:pPr>
       <w:r>
-        <w:t>4. Decisoes tecnicas</w:t>
+        <w:t>4. Decisões técnicas</w:t>
       </w:r>
     </w:p>
     <w:tbl>
@@ -1081,14 +993,8 @@
             <w:shd w:fill="F2F4F7"/>
           </w:tcPr>
           <w:p>
-            <w:r/>
             <w:r>
-              <w:rPr>
-                <w:rFonts w:ascii="Calibri" w:hAnsi="Calibri"/>
-                <w:b/>
-                <w:sz w:val="18"/>
-              </w:rPr>
-              <w:t>Decisao</w:t>
+              <w:t>Decisão</w:t>
             </w:r>
           </w:p>
         </w:tc>
@@ -1118,14 +1024,8 @@
             <w:vAlign w:val="center"/>
           </w:tcPr>
           <w:p>
-            <w:r/>
             <w:r>
-              <w:rPr>
-                <w:rFonts w:ascii="Calibri" w:hAnsi="Calibri"/>
-                <w:b w:val="0"/>
-                <w:sz w:val="18"/>
-              </w:rPr>
-              <w:t>Microservicos separados</w:t>
+              <w:t>Microsserviços separados</w:t>
             </w:r>
           </w:p>
         </w:tc>
@@ -1171,14 +1071,8 @@
             <w:vAlign w:val="center"/>
           </w:tcPr>
           <w:p>
-            <w:r/>
             <w:r>
-              <w:rPr>
-                <w:rFonts w:ascii="Calibri" w:hAnsi="Calibri"/>
-                <w:b w:val="0"/>
-                <w:sz w:val="18"/>
-              </w:rPr>
-              <w:t>Consultas simples ficam diretas e sincronas</w:t>
+              <w:t>Consultas simples ficam diretas e síncronas</w:t>
             </w:r>
           </w:p>
         </w:tc>
@@ -1207,14 +1101,8 @@
             <w:vAlign w:val="center"/>
           </w:tcPr>
           <w:p>
-            <w:r/>
             <w:r>
-              <w:rPr>
-                <w:rFonts w:ascii="Calibri" w:hAnsi="Calibri"/>
-                <w:b w:val="0"/>
-                <w:sz w:val="18"/>
-              </w:rPr>
-              <w:t>Reduz acoplamento entre criacao de pedido e baixa de estoque</w:t>
+              <w:t>Reduz acoplamento entre criação de pedido e baixa de estoque</w:t>
             </w:r>
           </w:p>
         </w:tc>
@@ -1279,14 +1167,8 @@
             <w:vAlign w:val="center"/>
           </w:tcPr>
           <w:p>
-            <w:r/>
             <w:r>
-              <w:rPr>
-                <w:rFonts w:ascii="Calibri" w:hAnsi="Calibri"/>
-                <w:b w:val="0"/>
-                <w:sz w:val="18"/>
-              </w:rPr>
-              <w:t>Auditoria com binding por padrao pedido.#</w:t>
+              <w:t>Auditoria com binding por padrão pedido.#</w:t>
             </w:r>
           </w:p>
         </w:tc>
@@ -1315,14 +1197,8 @@
             <w:vAlign w:val="center"/>
           </w:tcPr>
           <w:p>
-            <w:r/>
             <w:r>
-              <w:rPr>
-                <w:rFonts w:ascii="Calibri" w:hAnsi="Calibri"/>
-                <w:b w:val="0"/>
-                <w:sz w:val="18"/>
-              </w:rPr>
-              <w:t>Permite simular duas sessoes comprando o mesmo item</w:t>
+              <w:t>Permite simular duas sessões comprando o mesmo item</w:t>
             </w:r>
           </w:p>
         </w:tc>
@@ -1351,14 +1227,8 @@
             <w:vAlign w:val="center"/>
           </w:tcPr>
           <w:p>
-            <w:r/>
             <w:r>
-              <w:rPr>
-                <w:rFonts w:ascii="Calibri" w:hAnsi="Calibri"/>
-                <w:b w:val="0"/>
-                <w:sz w:val="18"/>
-              </w:rPr>
-              <w:t>Banco ja utilizado antes da publicacao do enunciado</w:t>
+              <w:t>Banco já utilizado antes da publicação do enunciado</w:t>
             </w:r>
           </w:p>
         </w:tc>
@@ -1464,14 +1334,8 @@
             <w:shd w:fill="F2F4F7"/>
           </w:tcPr>
           <w:p>
-            <w:r/>
             <w:r>
-              <w:rPr>
-                <w:rFonts w:ascii="Calibri" w:hAnsi="Calibri"/>
-                <w:b/>
-                <w:sz w:val="18"/>
-              </w:rPr>
-              <w:t>Descricao</w:t>
+              <w:t>Descrição</w:t>
             </w:r>
           </w:p>
         </w:tc>
@@ -2026,14 +1890,8 @@
             <w:shd w:fill="F2F4F7"/>
           </w:tcPr>
           <w:p>
-            <w:r/>
             <w:r>
-              <w:rPr>
-                <w:rFonts w:ascii="Calibri" w:hAnsi="Calibri"/>
-                <w:b/>
-                <w:sz w:val="18"/>
-              </w:rPr>
-              <w:t>Descricao</w:t>
+              <w:t>Descrição</w:t>
             </w:r>
           </w:p>
         </w:tc>
@@ -2185,14 +2043,8 @@
             <w:vAlign w:val="center"/>
           </w:tcPr>
           <w:p>
-            <w:r/>
             <w:r>
-              <w:rPr>
-                <w:rFonts w:ascii="Calibri" w:hAnsi="Calibri"/>
-                <w:b w:val="0"/>
-                <w:sz w:val="18"/>
-              </w:rPr>
-              <w:t>Data/hora de criacao</w:t>
+              <w:t>Data/hora de criação</w:t>
             </w:r>
           </w:p>
         </w:tc>
@@ -2433,14 +2285,8 @@
             <w:shd w:fill="F2F4F7"/>
           </w:tcPr>
           <w:p>
-            <w:r/>
             <w:r>
-              <w:rPr>
-                <w:rFonts w:ascii="Calibri" w:hAnsi="Calibri"/>
-                <w:b/>
-                <w:sz w:val="18"/>
-              </w:rPr>
-              <w:t>Descricao</w:t>
+              <w:t>Descrição</w:t>
             </w:r>
           </w:p>
         </w:tc>
@@ -2645,14 +2491,8 @@
             <w:vAlign w:val="center"/>
           </w:tcPr>
           <w:p>
-            <w:r/>
             <w:r>
-              <w:rPr>
-                <w:rFonts w:ascii="Calibri" w:hAnsi="Calibri"/>
-                <w:b w:val="0"/>
-                <w:sz w:val="18"/>
-              </w:rPr>
-              <w:t>Descricao do resultado</w:t>
+              <w:t>Descrição do resultado</w:t>
             </w:r>
           </w:p>
         </w:tc>
@@ -2734,7 +2574,7 @@
     </w:p>
     <w:p>
       <w:r>
-        <w:t>Publicado pelo servico pedido quando um pedido permanece PROCESSANDO por mais de 30 segundos sem receber resposta do estoque.</w:t>
+        <w:t>Publicado pelo serviço pedido quando um pedido permanece PROCESSANDO por mais de 30 segundos sem receber resposta do estoque.</w:t>
       </w:r>
     </w:p>
     <w:tbl>
@@ -2792,14 +2632,8 @@
             <w:shd w:fill="F2F4F7"/>
           </w:tcPr>
           <w:p>
-            <w:r/>
             <w:r>
-              <w:rPr>
-                <w:rFonts w:ascii="Calibri" w:hAnsi="Calibri"/>
-                <w:b/>
-                <w:sz w:val="18"/>
-              </w:rPr>
-              <w:t>Descricao</w:t>
+              <w:t>Descrição</w:t>
             </w:r>
           </w:p>
         </w:tc>
@@ -2951,14 +2785,8 @@
             <w:vAlign w:val="center"/>
           </w:tcPr>
           <w:p>
-            <w:r/>
             <w:r>
-              <w:rPr>
-                <w:rFonts w:ascii="Calibri" w:hAnsi="Calibri"/>
-                <w:b w:val="0"/>
-                <w:sz w:val="18"/>
-              </w:rPr>
-              <w:t>Explicacao da auditoria</w:t>
+              <w:t>Explicação da auditoria</w:t>
             </w:r>
           </w:p>
         </w:tc>
@@ -3004,14 +2832,8 @@
             <w:vAlign w:val="center"/>
           </w:tcPr>
           <w:p>
-            <w:r/>
             <w:r>
-              <w:rPr>
-                <w:rFonts w:ascii="Calibri" w:hAnsi="Calibri"/>
-                <w:b w:val="0"/>
-                <w:sz w:val="18"/>
-              </w:rPr>
-              <w:t>Data/hora de criacao</w:t>
+              <w:t>Data/hora de criação</w:t>
             </w:r>
           </w:p>
         </w:tc>
@@ -3099,14 +2921,8 @@
             <w:shd w:fill="F2F4F7"/>
           </w:tcPr>
           <w:p>
-            <w:r/>
             <w:r>
-              <w:rPr>
-                <w:rFonts w:ascii="Calibri" w:hAnsi="Calibri"/>
-                <w:b/>
-                <w:sz w:val="18"/>
-              </w:rPr>
-              <w:t>Servico</w:t>
+              <w:t>Serviço</w:t>
             </w:r>
           </w:p>
         </w:tc>
@@ -3117,14 +2933,8 @@
             <w:shd w:fill="F2F4F7"/>
           </w:tcPr>
           <w:p>
-            <w:r/>
             <w:r>
-              <w:rPr>
-                <w:rFonts w:ascii="Calibri" w:hAnsi="Calibri"/>
-                <w:b/>
-                <w:sz w:val="18"/>
-              </w:rPr>
-              <w:t>Metodo</w:t>
+              <w:t>Método</w:t>
             </w:r>
           </w:p>
         </w:tc>
@@ -3153,14 +2963,8 @@
             <w:shd w:fill="F2F4F7"/>
           </w:tcPr>
           <w:p>
-            <w:r/>
             <w:r>
-              <w:rPr>
-                <w:rFonts w:ascii="Calibri" w:hAnsi="Calibri"/>
-                <w:b/>
-                <w:sz w:val="18"/>
-              </w:rPr>
-              <w:t>Descricao</w:t>
+              <w:t>Descrição</w:t>
             </w:r>
           </w:p>
         </w:tc>
@@ -4152,7 +3956,7 @@
         <w:pStyle w:val="Heading1"/>
       </w:pPr>
       <w:r>
-        <w:t>8. Configuracao e execucao</w:t>
+        <w:t>8. Configuração e execução</w:t>
       </w:r>
     </w:p>
     <w:p>
@@ -4184,7 +3988,7 @@
         <w:pStyle w:val="ListBullet"/>
       </w:pPr>
       <w:r>
-        <w:t>Executar os servicos na ordem: RabbitMQ, produto, estoque, pedido e cloud-commerce.</w:t>
+        <w:t>Executar os serviços na ordem: RabbitMQ, produto, estoque, pedido e cloud-commerce.</w:t>
       </w:r>
     </w:p>
     <w:p>
@@ -4192,10 +3996,6 @@
         <w:pStyle w:val="CodeBlock"/>
       </w:pPr>
       <w:r>
-        <w:rPr>
-          <w:rFonts w:ascii="Consolas" w:hAnsi="Consolas"/>
-          <w:sz w:val="18"/>
-        </w:rPr>
         <w:t>Set-Location "C:\CAMINHO\PARA\microservicoscommerce"</w:t>
         <w:br/>
         <w:t>docker compose up -d rabbitmq</w:t>
@@ -4230,7 +4030,7 @@
         <w:pStyle w:val="Heading1"/>
       </w:pPr>
       <w:r>
-        <w:t>9. Criterios de funcionamento</w:t>
+        <w:t>9. Critérios de funcionamento</w:t>
       </w:r>
     </w:p>
     <w:tbl>
@@ -4251,14 +4051,8 @@
             <w:shd w:fill="F2F4F7"/>
           </w:tcPr>
           <w:p>
-            <w:r/>
             <w:r>
-              <w:rPr>
-                <w:rFonts w:ascii="Calibri" w:hAnsi="Calibri"/>
-                <w:b/>
-                <w:sz w:val="18"/>
-              </w:rPr>
-              <w:t>Criterio</w:t>
+              <w:t>Critério</w:t>
             </w:r>
           </w:p>
         </w:tc>
@@ -4288,14 +4082,8 @@
             <w:vAlign w:val="center"/>
           </w:tcPr>
           <w:p>
-            <w:r/>
             <w:r>
-              <w:rPr>
-                <w:rFonts w:ascii="Calibri" w:hAnsi="Calibri"/>
-                <w:b w:val="0"/>
-                <w:sz w:val="18"/>
-              </w:rPr>
-              <w:t>Pelo menos 2 microservicos</w:t>
+              <w:t>Pelo menos 2 microsserviços</w:t>
             </w:r>
           </w:p>
         </w:tc>
@@ -4504,14 +4292,8 @@
             <w:vAlign w:val="center"/>
           </w:tcPr>
           <w:p>
-            <w:r/>
             <w:r>
-              <w:rPr>
-                <w:rFonts w:ascii="Calibri" w:hAnsi="Calibri"/>
-                <w:b w:val="0"/>
-                <w:sz w:val="18"/>
-              </w:rPr>
-              <w:t>README de execucao</w:t>
+              <w:t>README de execução</w:t>
             </w:r>
           </w:p>
         </w:tc>
@@ -4540,14 +4322,8 @@
             <w:vAlign w:val="center"/>
           </w:tcPr>
           <w:p>
-            <w:r/>
             <w:r>
-              <w:rPr>
-                <w:rFonts w:ascii="Calibri" w:hAnsi="Calibri"/>
-                <w:b w:val="0"/>
-                <w:sz w:val="18"/>
-              </w:rPr>
-              <w:t>Persistencia H2/SQLite</w:t>
+              <w:t>Persistência H2/SQLite</w:t>
             </w:r>
           </w:p>
         </w:tc>
@@ -4557,14 +4333,8 @@
             <w:vAlign w:val="center"/>
           </w:tcPr>
           <w:p>
-            <w:r/>
             <w:r>
-              <w:rPr>
-                <w:rFonts w:ascii="Calibri" w:hAnsi="Calibri"/>
-                <w:b w:val="0"/>
-                <w:sz w:val="18"/>
-              </w:rPr>
-              <w:t>Nao usado; projeto manteve Supabase/PostgreSQL</w:t>
+              <w:t>Não usado; projeto manteve Supabase/PostgreSQL</w:t>
             </w:r>
           </w:p>
         </w:tc>
@@ -4629,14 +4399,8 @@
             <w:vAlign w:val="center"/>
           </w:tcPr>
           <w:p>
-            <w:r/>
             <w:r>
-              <w:rPr>
-                <w:rFonts w:ascii="Calibri" w:hAnsi="Calibri"/>
-                <w:b w:val="0"/>
-                <w:sz w:val="18"/>
-              </w:rPr>
-              <w:t>Parcial; auditoria possui logs explicitos</w:t>
+              <w:t>Parcial; auditoria possui logs explícitos</w:t>
             </w:r>
           </w:p>
         </w:tc>
@@ -4648,17 +4412,17 @@
         <w:pStyle w:val="Heading1"/>
       </w:pPr>
       <w:r>
-        <w:t>10. Conclusao</w:t>
+        <w:t>10. Conclusão</w:t>
       </w:r>
     </w:p>
     <w:p>
       <w:r>
-        <w:t>O Cloud Commerce demonstra um fluxo EDA funcional com Spring Boot e RabbitMQ. O servico de pedido inicia o processo, o estoque valida disponibilidade por evento e o pedido recebe a resposta para atualizar seu status.</w:t>
+        <w:t>O Cloud Commerce demonstra um fluxo EDA funcional com Spring Boot e RabbitMQ. O serviço de pedido inicia o processo, o estoque valida disponibilidade por evento e o pedido recebe a resposta para atualizar seu status.</w:t>
       </w:r>
     </w:p>
     <w:p>
       <w:r>
-        <w:t>A implementacao tambem inclui uma TopicExchange para auditoria de pedidos que permanecem sem resposta do estoque, atendendo ao criterio de uso de mais de um tipo de exchange.</w:t>
+        <w:t>A implementação também inclui uma TopicExchange para auditoria de pedidos que permanecem sem resposta do estoque, atendendo ao critério de uso de mais de um tipo de exchange.</w:t>
       </w:r>
     </w:p>
     <w:sectPr>

</xml_diff>